<commit_message>
update logic dan susunan sidebar
</commit_message>
<xml_diff>
--- a/public/templates/Template_BA.docx
+++ b/public/templates/Template_BA.docx
@@ -30,8 +30,6 @@
       </w:pPr>
       <w:r>
         <w:t>Pada hari ini</w:t>
-      </w:r>
-      <w:r>
         <w:tab/>
         <w:t>:</w:t>
       </w:r>
@@ -90,7 +88,7 @@
         <w:rPr>
           <w:spacing w:val="-2"/>
         </w:rPr>
-        <w:t>{namaPihakPertama}</w:t>
+        <w:t>Astri Oktavina</w:t>
       </w:r>
       <w:r>
         <w:tab/>
@@ -112,7 +110,7 @@
         <w:t xml:space="preserve"> </w:t>
       </w:r>
       <w:r>
-        <w:t>{jabatanPihakPertama}</w:t>
+        <w:t>Assistant Manager KAS PT PLN INDONESIA POWER UBP PRIOK</w:t>
       </w:r>
       <w:r>
         <w:rPr>
@@ -275,8 +273,6 @@
       </w:r>
       <w:r>
         <w:t>.</w:t>
-      </w:r>
-      <w:r>
         <w:tab/>
       </w:r>
       <w:r>
@@ -810,7 +806,7 @@
           <w:b/>
           <w:sz w:val="24"/>
         </w:rPr>
-        <w:t>{jabatanPihakPertama}</w:t>
+        <w:t>Assistant Manager KAS</w:t>
       </w:r>
       <w:r>
         <w:rPr>
@@ -913,7 +909,7 @@
           <w:rFonts w:ascii="Arial"/>
           <w:b/>
         </w:rPr>
-        <w:t>{namaPihakPertama}</w:t>
+        <w:t>Astri Oktavina</w:t>
       </w:r>
       <w:r>
         <w:rPr>

</xml_diff>